<commit_message>
feat(report): strip redline markers (BILO/STALO) and all emoji from docx; robust rebuild when file locked by Word
</commit_message>
<xml_diff>
--- a/ОТЧЁТ_Milvus_банковские_данные.docx
+++ b/ОТЧЁТ_Milvus_банковские_данные.docx
@@ -1801,7 +1801,7 @@
       </w:pPr>
       <w:r>
         <w:rPr/>
-        <w:t xml:space="preserve">✅ СТАЛО (уточнение, проверено ✔): ресурсная группа привязывается к коллекции (свойство collection.resource_groups) или к базе данных (database.resource_groups); привязки «пользователь → ресурсная группа» в актуальном API нет. На Standalone узел запросов один, поэтому изоляция носит демонстрационный характер (см. также раздел 2.8 и 3.5.3).</w:t>
+        <w:t xml:space="preserve">(уточнение, проверено): ресурсная группа привязывается к коллекции (свойство collection.resource_groups) или к базе данных (database.resource_groups); привязки «пользователь → ресурсная группа» в актуальном API нет. На Standalone узел запросов один, поэтому изоляция носит демонстрационный характер (см. также раздел 2.8 и 3.5.3).</w:t>
       </w:r>
     </w:p>
     <w:p>
@@ -1850,7 +1850,7 @@
                     <pic:cNvPicPr/>
                   </pic:nvPicPr>
                   <pic:blipFill>
-                    <a:blip r:embed="R2e7fb1b1922f4d91" cstate="print"/>
+                    <a:blip r:embed="Re29246978c8c4acf" cstate="print"/>
                     <a:stretch>
                       <a:fillRect/>
                     </a:stretch>
@@ -2118,7 +2118,7 @@
                     <pic:cNvPicPr/>
                   </pic:nvPicPr>
                   <pic:blipFill>
-                    <a:blip r:embed="Rbc4c4c7c53c04bfa" cstate="print"/>
+                    <a:blip r:embed="R0f0b609e56b047b5" cstate="print"/>
                     <a:stretch>
                       <a:fillRect/>
                     </a:stretch>
@@ -2220,16 +2220,7 @@
       </w:pPr>
       <w:r>
         <w:rPr/>
-        <w:t xml:space="preserve">⛔ БЫЛО (исходная редакция): ограничения Milvus сведены к DECIMAL / UNIQUE / FOREIGN KEY; предполагалось, что коллекции Clients, Currencies, Accounts и Cards могут быть чисто скалярными (без векторного поля).</w:t>
-      </w:r>
-    </w:p>
-    <w:p>
-      <w:pPr>
-        <w:jc w:val="both"/>
-      </w:pPr>
-      <w:r>
-        <w:rPr/>
-        <w:t xml:space="preserve">✅ СТАЛО (проверено на живом Milvus v3.0.1 и v2.6.11): Milvus не создаёт коллекцию, в схеме которой нет ни одного векторного поля. Попытка создать такую коллекцию завершается ошибкой:</w:t>
+        <w:t xml:space="preserve">(проверено на живом Milvus v3.0.1 и v2.6.11): Milvus не создаёт коллекцию, в схеме которой нет ни одного векторного поля. Попытка создать такую коллекцию завершается ошибкой:</w:t>
       </w:r>
     </w:p>
     <w:p>
@@ -2280,7 +2271,7 @@
           <m:sSub>
             <m:e>
               <m:r>
-                <m:t xml:space="preserve">ector  FLOAT</m:t>
+                <m:t xml:space="preserve">ector FLOAT</m:t>
               </m:r>
             </m:e>
             <m:sub>
@@ -2322,7 +2313,7 @@
       </w:pPr>
       <w:r>
         <w:rPr/>
-        <w:t xml:space="preserve">В таблицы 2.2–2.5 добавлена соответствующая строка (см. пометки ✅ СТАЛО ниже). Семантического смысла поле не несёт и на проектирование предметной области не влияет.</w:t>
+        <w:t xml:space="preserve">В таблицы 2.2–2.5 добавлена соответствующая строка (см. пометки ниже). Семантического смысла поле не несёт и на проектирование предметной области не влияет.</w:t>
       </w:r>
     </w:p>
     <w:p>
@@ -2353,7 +2344,7 @@
                     <pic:cNvPicPr/>
                   </pic:nvPicPr>
                   <pic:blipFill>
-                    <a:blip r:embed="Rb8d75ad880574c97" cstate="print"/>
+                    <a:blip r:embed="R57d053c2bdc94571" cstate="print"/>
                     <a:stretch>
                       <a:fillRect/>
                     </a:stretch>
@@ -2868,7 +2859,7 @@
       </w:pPr>
       <w:r>
         <w:rPr/>
-        <w:t xml:space="preserve">✅ СТАЛО (уточнение ограничений). Поля со значением NULL (в таблице помечены «NULL») должны объявляться в схеме с параметром nullable=True: interest_rate, term_months, service_cost. Без этого вставка None в такое поле завершается ошибкой, а не NULL-значением (подробнее — примечание к таблице 2.6 и раздел 3.2).</w:t>
+        <w:t xml:space="preserve">(уточнение ограничений). Поля со значением NULL (в таблице помечены «NULL») должны объявляться в схеме с параметром nullable=True: interest_rate, term_months, service_cost. Без этого вставка None в такое поле завершается ошибкой, а не NULL-значением (подробнее — примечание к таблице 2.6 и раздел 3.2).</w:t>
       </w:r>
     </w:p>
     <w:p>
@@ -2917,7 +2908,7 @@
                     <pic:cNvPicPr/>
                   </pic:nvPicPr>
                   <pic:blipFill>
-                    <a:blip r:embed="R2ab51b0d4bab4889" cstate="print"/>
+                    <a:blip r:embed="R1fd8a917b6a94911" cstate="print"/>
                     <a:stretch>
                       <a:fillRect/>
                     </a:stretch>
@@ -2965,7 +2956,7 @@
       </w:pPr>
       <w:r>
         <w:rPr/>
-        <w:t xml:space="preserve">✅ СТАЛО (проверено ✔): семантический поиск по клиентам по-прежнему не проектируется, однако Milvus не позволяет создать коллекцию вообще без векторного поля. Поэтому в схему добавлено техническое поле _tech_vector (FLOAT_VECTOR, dim = 2) с индексом FLAT; при вставке в него записывается [0.0, 0.0]. То же самое относится к коллекциям Currencies, Accounts и Cards.</w:t>
+        <w:t xml:space="preserve">(проверено): семантический поиск по клиентам по-прежнему не проектируется, однако Milvus не позволяет создать коллекцию вообще без векторного поля. Поэтому в схему добавлено техническое поле _tech_vector (FLOAT_VECTOR, dim = 2) с индексом FLAT; при вставке в него записывается [0.0, 0.0]. То же самое относится к коллекциям Currencies, Accounts и Cards.</w:t>
       </w:r>
     </w:p>
     <w:p>
@@ -3481,7 +3472,7 @@
           <w:p>
             <w:pPr/>
             <w:r>
-              <w:t xml:space="preserve">✅ _tech_vector</w:t>
+              <w:t xml:space="preserve">_tech_vector</w:t>
             </w:r>
           </w:p>
         </w:tc>
@@ -3556,7 +3547,7 @@
                     <pic:cNvPicPr/>
                   </pic:nvPicPr>
                   <pic:blipFill>
-                    <a:blip r:embed="Rf3d6950b2399474b" cstate="print"/>
+                    <a:blip r:embed="R43c6b72a6d1b44ab" cstate="print"/>
                     <a:stretch>
                       <a:fillRect/>
                     </a:stretch>
@@ -3612,7 +3603,7 @@
     </w:p>
     <w:tbl>
       <w:tblPr>
-        <w:tblW w:w="8307" w:type="dxa"/>
+        <w:tblW w:w="8306" w:type="dxa"/>
         <w:tblBorders>
           <w:top w:val="single" w:sz="4"/>
           <w:left w:val="single" w:sz="4"/>
@@ -3623,11 +3614,11 @@
         </w:tblBorders>
       </w:tblPr>
       <w:tblGrid>
-        <w:gridCol w:w="1016"/>
-        <w:gridCol w:w="1234"/>
-        <w:gridCol w:w="2615"/>
+        <w:gridCol w:w="953"/>
+        <w:gridCol w:w="1246"/>
+        <w:gridCol w:w="2640"/>
         <w:gridCol w:w="900"/>
-        <w:gridCol w:w="2542"/>
+        <w:gridCol w:w="2567"/>
       </w:tblGrid>
       <w:tr>
         <w:tc>
@@ -3859,7 +3850,7 @@
           <w:p>
             <w:pPr/>
             <w:r>
-              <w:t xml:space="preserve">✅ _tech_vector</w:t>
+              <w:t xml:space="preserve">_tech_vector</w:t>
             </w:r>
           </w:p>
         </w:tc>
@@ -3934,7 +3925,7 @@
                     <pic:cNvPicPr/>
                   </pic:nvPicPr>
                   <pic:blipFill>
-                    <a:blip r:embed="Rb633840e467f4e43" cstate="print"/>
+                    <a:blip r:embed="Rc151135d80dc4970" cstate="print"/>
                     <a:stretch>
                       <a:fillRect/>
                     </a:stretch>
@@ -4405,7 +4396,7 @@
           <w:p>
             <w:pPr/>
             <w:r>
-              <w:t xml:space="preserve">✅ _tech_vector</w:t>
+              <w:t xml:space="preserve">_tech_vector</w:t>
             </w:r>
           </w:p>
         </w:tc>
@@ -4498,7 +4489,7 @@
                     <pic:cNvPicPr/>
                   </pic:nvPicPr>
                   <pic:blipFill>
-                    <a:blip r:embed="R96c921788f3044b2" cstate="print"/>
+                    <a:blip r:embed="Rb77d6f2a47584cde" cstate="print"/>
                     <a:stretch>
                       <a:fillRect/>
                     </a:stretch>
@@ -4969,7 +4960,7 @@
           <w:p>
             <w:pPr/>
             <w:r>
-              <w:t xml:space="preserve">✅ _tech_vector</w:t>
+              <w:t xml:space="preserve">_tech_vector</w:t>
             </w:r>
           </w:p>
         </w:tc>
@@ -5062,7 +5053,7 @@
                     <pic:cNvPicPr/>
                   </pic:nvPicPr>
                   <pic:blipFill>
-                    <a:blip r:embed="R071cca7680d64cb8" cstate="print"/>
+                    <a:blip r:embed="Rdf6c43d684ee4a25" cstate="print"/>
                     <a:stretch>
                       <a:fillRect/>
                     </a:stretch>
@@ -5619,7 +5610,7 @@
       </w:pPr>
       <w:r>
         <w:rPr/>
-        <w:t xml:space="preserve">✅ СТАЛО (проверка NULL). Поля card_id, mcc и purpose по проекту допускают NULL, поэтому объявляются с nullable=True. Без этого вставка None завершается ошибкой:</w:t>
+        <w:t xml:space="preserve">(проверка NULL). Поля card_id, mcc и purpose по проекту допускают NULL, поэтому объявляются с nullable=True. Без этого вставка None завершается ошибкой:</w:t>
       </w:r>
     </w:p>
     <w:p>
@@ -5637,7 +5628,7 @@
       </w:pPr>
       <w:r>
         <w:rPr/>
-        <w:t xml:space="preserve">После объявления nullable=True вставка None работает, чтение возвращает None, а фильтр card_id is null корректно находит такие записи (проверено ✔).</w:t>
+        <w:t xml:space="preserve">После объявления nullable=True вставка None работает, чтение возвращает None, а фильтр card_id is null корректно находит такие записи (проверено).</w:t>
       </w:r>
     </w:p>
     <w:p>
@@ -5713,7 +5704,7 @@
                     <pic:cNvPicPr/>
                   </pic:nvPicPr>
                   <pic:blipFill>
-                    <a:blip r:embed="Rd13bd2cdebef44b1" cstate="print"/>
+                    <a:blip r:embed="R35fe9991d22f4b28" cstate="print"/>
                     <a:stretch>
                       <a:fillRect/>
                     </a:stretch>
@@ -5765,7 +5756,7 @@
                     <pic:cNvPicPr/>
                   </pic:nvPicPr>
                   <pic:blipFill>
-                    <a:blip r:embed="R76961093d99e4eb9" cstate="print"/>
+                    <a:blip r:embed="R2fc32821f78d4b54" cstate="print"/>
                     <a:stretch>
                       <a:fillRect/>
                     </a:stretch>
@@ -6241,25 +6232,25 @@
       </w:pPr>
       <w:r>
         <w:rPr/>
-        <w:t xml:space="preserve">✅ СТАЛО (уточнение по результатам прогона). Префиксы предписаны авторами модели и в работе используются, однако утверждение «без префиксов качество снижается» для нашей выборки оказалось слишком сильным. Замер на одном и том же запросе (8 банковских продуктов, топ-4):</w:t>
-      </w:r>
-    </w:p>
-    <w:p>
-      <w:pPr>
-        <w:jc w:val="both"/>
-      </w:pPr>
-      <w:r>
-        <w:rPr/>
-        <w:t xml:space="preserve">с префиксом "query:"   близости: 0.8847 / 0.8783 / 0.8683 / 0.8534</w:t>
-      </w:r>
-    </w:p>
-    <w:p>
-      <w:pPr>
-        <w:jc w:val="both"/>
-      </w:pPr>
-      <w:r>
-        <w:rPr/>
-        <w:t xml:space="preserve">без префикса           близости: 0.8925 / 0.8867 / 0.8672 / 0.8550</w:t>
+        <w:t xml:space="preserve">(уточнение по результатам прогона). Префиксы предписаны авторами модели и в работе используются, однако утверждение «без префиксов качество снижается» для нашей выборки оказалось слишком сильным. Замер на одном и том же запросе (8 банковских продуктов, топ-4):</w:t>
+      </w:r>
+    </w:p>
+    <w:p>
+      <w:pPr>
+        <w:jc w:val="both"/>
+      </w:pPr>
+      <w:r>
+        <w:rPr/>
+        <w:t xml:space="preserve">с префиксом "query:" близости: 0.8847 / 0.8783 / 0.8683 / 0.8534</w:t>
+      </w:r>
+    </w:p>
+    <w:p>
+      <w:pPr>
+        <w:jc w:val="both"/>
+      </w:pPr>
+      <w:r>
+        <w:rPr/>
+        <w:t xml:space="preserve">без префикса близости: 0.8925 / 0.8867 / 0.8672 / 0.8550</w:t>
       </w:r>
     </w:p>
     <w:p>
@@ -7172,27 +7163,27 @@
           <w:rFonts w:ascii="Consolas" w:hAnsi="Consolas" w:eastAsia="Consolas"/>
           <w:sz w:val="16"/>
         </w:rPr>
-        <w:t xml:space="preserve">schema_products.add_field("interest_rate", DataType.FLOAT)      # ⛔ для NULL нужен nullable=True — см. ✅ в разделе 3.2</w:t>
-      </w:r>
-    </w:p>
-    <w:p>
-      <w:pPr/>
-      <w:r>
-        <w:rPr>
-          <w:rFonts w:ascii="Consolas" w:hAnsi="Consolas" w:eastAsia="Consolas"/>
-          <w:sz w:val="16"/>
-        </w:rPr>
-        <w:t xml:space="preserve">schema_products.add_field("term_months", DataType.INT32)        # ⛔ для NULL нужен nullable=True</w:t>
-      </w:r>
-    </w:p>
-    <w:p>
-      <w:pPr/>
-      <w:r>
-        <w:rPr>
-          <w:rFonts w:ascii="Consolas" w:hAnsi="Consolas" w:eastAsia="Consolas"/>
-          <w:sz w:val="16"/>
-        </w:rPr>
-        <w:t xml:space="preserve">schema_products.add_field("service_cost", DataType.FLOAT)       # ⛔ для NULL нужен nullable=True</w:t>
+        <w:t xml:space="preserve">schema_products.add_field("interest_rate", DataType.FLOAT)      #  для NULL нужен nullable=True — см.  в разделе 3.2</w:t>
+      </w:r>
+    </w:p>
+    <w:p>
+      <w:pPr/>
+      <w:r>
+        <w:rPr>
+          <w:rFonts w:ascii="Consolas" w:hAnsi="Consolas" w:eastAsia="Consolas"/>
+          <w:sz w:val="16"/>
+        </w:rPr>
+        <w:t xml:space="preserve">schema_products.add_field("term_months", DataType.INT32)        #  для NULL нужен nullable=True</w:t>
+      </w:r>
+    </w:p>
+    <w:p>
+      <w:pPr/>
+      <w:r>
+        <w:rPr>
+          <w:rFonts w:ascii="Consolas" w:hAnsi="Consolas" w:eastAsia="Consolas"/>
+          <w:sz w:val="16"/>
+        </w:rPr>
+        <w:t xml:space="preserve">schema_products.add_field("service_cost", DataType.FLOAT)       #  для NULL нужен nullable=True</w:t>
       </w:r>
     </w:p>
     <w:p>
@@ -7392,7 +7383,7 @@
           <w:rFonts w:ascii="Consolas" w:hAnsi="Consolas" w:eastAsia="Consolas"/>
           <w:sz w:val="16"/>
         </w:rPr>
-        <w:t xml:space="preserve">schema_transactions.add_field("card_id", DataType.INT64)                 # ⛔ NULL запрещён — см. ✅ в разделе 3.2</w:t>
+        <w:t xml:space="preserve">schema_transactions.add_field("card_id", DataType.INT64)                 #  NULL запрещён — см.  в разделе 3.2</w:t>
       </w:r>
     </w:p>
     <w:p>
@@ -7452,7 +7443,7 @@
           <w:rFonts w:ascii="Consolas" w:hAnsi="Consolas" w:eastAsia="Consolas"/>
           <w:sz w:val="16"/>
         </w:rPr>
-        <w:t xml:space="preserve">schema_transactions.add_field("mcc", DataType.VARCHAR, max_length=4)     # ⛔ NULL запрещён — см. ✅ в разделе 3.2</w:t>
+        <w:t xml:space="preserve">schema_transactions.add_field("mcc", DataType.VARCHAR, max_length=4)     #  NULL запрещён — см.  в разделе 3.2</w:t>
       </w:r>
     </w:p>
     <w:p>
@@ -7643,7 +7634,7 @@
                     <pic:cNvPicPr/>
                   </pic:nvPicPr>
                   <pic:blipFill>
-                    <a:blip r:embed="R799615a79f0f4979" cstate="print"/>
+                    <a:blip r:embed="R5fb3df3ac5e24372" cstate="print"/>
                     <a:stretch>
                       <a:fillRect/>
                     </a:stretch>
@@ -7695,7 +7686,7 @@
                     <pic:cNvPicPr/>
                   </pic:nvPicPr>
                   <pic:blipFill>
-                    <a:blip r:embed="Rb9600864e8104e80" cstate="print"/>
+                    <a:blip r:embed="R21357808cad54f4f" cstate="print"/>
                     <a:stretch>
                       <a:fillRect/>
                     </a:stretch>
@@ -7747,7 +7738,7 @@
                     <pic:cNvPicPr/>
                   </pic:nvPicPr>
                   <pic:blipFill>
-                    <a:blip r:embed="Rf2118cf6328c49b4" cstate="print"/>
+                    <a:blip r:embed="R0c7047e65ac14af5" cstate="print"/>
                     <a:stretch>
                       <a:fillRect/>
                     </a:stretch>
@@ -7813,7 +7804,7 @@
       </w:pPr>
       <w:r>
         <w:rPr/>
-        <w:t xml:space="preserve">✅ СТАЛО (уточнение, проверено ✔): admin — встроенная роль Milvus, она существует в системе изначально, и повторно создавать её не нужно (create_role("admin") завершается ошибкой «role [name:"admin"] already exists»). Вторая встроенная роль — public. Роли analyst и viewer создаются как пользовательские.</w:t>
+        <w:t xml:space="preserve">(уточнение, проверено): admin — встроенная роль Milvus, она существует в системе изначально, и повторно создавать её не нужно (create_role("admin") завершается ошибкой «role [name:"admin"] already exists»). Вторая встроенная роль — public. Роли analyst и viewer создаются как пользовательские.</w:t>
       </w:r>
     </w:p>
     <w:p>
@@ -7961,7 +7952,7 @@
                     <pic:cNvPicPr/>
                   </pic:nvPicPr>
                   <pic:blipFill>
-                    <a:blip r:embed="Re7b6495ab6e3454e" cstate="print"/>
+                    <a:blip r:embed="R3252f0176e46444e" cstate="print"/>
                     <a:stretch>
                       <a:fillRect/>
                     </a:stretch>
@@ -8036,7 +8027,7 @@
       </w:pPr>
       <w:r>
         <w:rPr/>
-        <w:t xml:space="preserve">✅ СТАЛО (уточнение механизма, проверено ✔): роль ресурсной группы в изоляции реализуется привязкой группы к коллекции, например:</w:t>
+        <w:t xml:space="preserve">(уточнение механизма, проверено): роль ресурсной группы в изоляции реализуется привязкой группы к коллекции, например:</w:t>
       </w:r>
     </w:p>
     <w:p>
@@ -8265,7 +8256,7 @@
                     <pic:cNvPicPr/>
                   </pic:nvPicPr>
                   <pic:blipFill>
-                    <a:blip r:embed="R876fa64527014863" cstate="print"/>
+                    <a:blip r:embed="R52f0946ac00841ce" cstate="print"/>
                     <a:stretch>
                       <a:fillRect/>
                     </a:stretch>
@@ -8780,7 +8771,7 @@
                     <pic:cNvPicPr/>
                   </pic:nvPicPr>
                   <pic:blipFill>
-                    <a:blip r:embed="Rfdfd6db611be4d0a" cstate="print"/>
+                    <a:blip r:embed="Rdb441f458c274d43" cstate="print"/>
                     <a:stretch>
                       <a:fillRect/>
                     </a:stretch>
@@ -8915,7 +8906,7 @@
           <w:rFonts w:ascii="Consolas" w:hAnsi="Consolas" w:eastAsia="Consolas"/>
           <w:sz w:val="16"/>
         </w:rPr>
-        <w:t xml:space="preserve">⛔ БЫЛО (исходная редакция): «После выполнения данных команд в Docker Desktop появились три работающих контейнера: milvus-standalone, milvus-minio, milvus-etcd. Команда docker ps подтвердила успешный запуск:» (далее приведён вывод docker ps с образами minio/minio и quay.io/coreos/etcd).</w:t>
+        <w:t xml:space="preserve">  (исходная редакция): «После выполнения данных команд в Docker Desktop появились три работающих контейнера: milvus-standalone, milvus-minio, milvus-etcd. Команда docker ps подтвердила успешный запуск:» (далее приведён вывод docker ps с образами minio/minio и quay.io/coreos/etcd).</w:t>
       </w:r>
     </w:p>
     <w:p>
@@ -8935,7 +8926,7 @@
           <w:rFonts w:ascii="Consolas" w:hAnsi="Consolas" w:eastAsia="Consolas"/>
           <w:sz w:val="16"/>
         </w:rPr>
-        <w:t xml:space="preserve">✅ СТАЛО (проверено по официальному скрипту ветки master и по живому стенду). Скрипт standalone_embed.sh запускает ОДИН контейнер milvus-standalone: etcd и объектное хранилище встроены в образ (переменные ETCD_USE_EMBED=true и COMMON_STORAGETYPE=local), поэтому отдельных контейнеров milvus-etcd и milvus-minio при таком запуске НЕ появляется. Три контейнера возникают только при развёртывании через docker-compose.yml (вариант, использованный в практической части):</w:t>
+        <w:t xml:space="preserve">Скрипт standalone_embed.sh запускает ОДИН контейнер milvus-standalone: etcd и объектное хранилище встроены в образ (переменные ETCD_USE_EMBED=true и COMMON_STORAGETYPE=local), поэтому отдельных контейнеров milvus-etcd и milvus-minio при таком запуске НЕ появляется. Три контейнера возникают только при развёртывании через docker-compose.yml (вариант, использованный в практической части):</w:t>
       </w:r>
     </w:p>
     <w:p>
@@ -9005,7 +8996,7 @@
           <w:rFonts w:ascii="Consolas" w:hAnsi="Consolas" w:eastAsia="Consolas"/>
           <w:sz w:val="16"/>
         </w:rPr>
-        <w:t xml:space="preserve">Приведённый ниже вывод docker ps сохранён как исходный (⛔); фактический вывод для стенда — выше.</w:t>
+        <w:t xml:space="preserve">Приведённый ниже вывод docker ps сохранён как исходный (); фактический вывод для стенда — выше.</w:t>
       </w:r>
     </w:p>
     <w:p>
@@ -9130,7 +9121,7 @@
           <w:rFonts w:ascii="Consolas" w:hAnsi="Consolas" w:eastAsia="Consolas"/>
           <w:sz w:val="16"/>
         </w:rPr>
-        <w:t xml:space="preserve">  defaultRootPassword: "MilvusRoot123!"     # ⛔ ключ находится ВНЕ секции security — не применяется</w:t>
+        <w:t xml:space="preserve">  defaultRootPassword: "MilvusRoot123!"     #  ключ находится ВНЕ секции security — не применяется</w:t>
       </w:r>
     </w:p>
     <w:p>
@@ -9150,7 +9141,7 @@
           <w:rFonts w:ascii="Consolas" w:hAnsi="Consolas" w:eastAsia="Consolas"/>
           <w:sz w:val="16"/>
         </w:rPr>
-        <w:t xml:space="preserve">⛔ БЫЛО: пароль из конфига ожидался рабочим (root.update_password с old_password="MilvusRoot123!").</w:t>
+        <w:t xml:space="preserve"> : пароль из конфига ожидался рабочим (root.update_password с old_password="MilvusRoot123!").</w:t>
       </w:r>
     </w:p>
     <w:p>
@@ -9170,7 +9161,7 @@
           <w:rFonts w:ascii="Consolas" w:hAnsi="Consolas" w:eastAsia="Consolas"/>
           <w:sz w:val="16"/>
         </w:rPr>
-        <w:t xml:space="preserve">✅ СТАЛО (проверено на Milvus 2.6.11 с этим же файлом): при таком размещении ключа авторизация включается, но пароль остаётся дефолтным — сервер принимает только пароль Milvus:</w:t>
+        <w:t xml:space="preserve">6.11 с этим же файлом): при таком размещении ключа авторизация включается, но пароль остаётся дефолтным — сервер принимает только пароль Milvus:</w:t>
       </w:r>
     </w:p>
     <w:p>
@@ -9255,7 +9246,7 @@
       </w:pPr>
       <w:r>
         <w:rPr/>
-        <w:t xml:space="preserve">defaultRootPassword: "MilvusDemo123"   # ВНУТРИ security; применяется при первой инициализации</w:t>
+        <w:t xml:space="preserve">defaultRootPassword: "MilvusDemo123" # ВНУТРИ security; применяется при первой инициализации</w:t>
       </w:r>
     </w:p>
     <w:p>
@@ -9390,7 +9381,7 @@
           <w:rFonts w:ascii="Consolas" w:hAnsi="Consolas" w:eastAsia="Consolas"/>
           <w:sz w:val="16"/>
         </w:rPr>
-        <w:t xml:space="preserve">✅ СТАЛО: при конфиге из «⛔ БЫЛО» этот код не выполняется — подключение падает раньше, на строке MilvusClient(..., password="MilvusRoot123!"). Рабочая последовательность: задать defaultRootPassword внутри common.security (см. выше), подключиться с этим паролем и затем его сменить, например:</w:t>
+        <w:t xml:space="preserve">при конфиге из « » этот код не выполняется — подключение падает раньше, на строке MilvusClient(..., password="MilvusRoot123!"). Рабочая последовательность: задать defaultRootPassword внутри common.security (см. выше), подключиться с этим паролем и затем его сменить, например:</w:t>
       </w:r>
     </w:p>
     <w:p>
@@ -9470,7 +9461,7 @@
           <w:rFonts w:ascii="Consolas" w:hAnsi="Consolas" w:eastAsia="Consolas"/>
           <w:sz w:val="16"/>
         </w:rPr>
-        <w:t xml:space="preserve">Смена пароля пользователя проверена ✔ (см. verify/probe_fix.log, раздел E).</w:t>
+        <w:t xml:space="preserve">Смена пароля пользователя проверена  (см. verify/probe_fix.log, раздел E).</w:t>
       </w:r>
     </w:p>
     <w:p>
@@ -9676,27 +9667,27 @@
           <w:rFonts w:ascii="Consolas" w:hAnsi="Consolas" w:eastAsia="Consolas"/>
           <w:sz w:val="16"/>
         </w:rPr>
-        <w:t xml:space="preserve">schema_products.add_field("interest_rate", DataType.FLOAT)      # ⛔ для NULL нужен nullable=True</w:t>
-      </w:r>
-    </w:p>
-    <w:p>
-      <w:pPr/>
-      <w:r>
-        <w:rPr>
-          <w:rFonts w:ascii="Consolas" w:hAnsi="Consolas" w:eastAsia="Consolas"/>
-          <w:sz w:val="16"/>
-        </w:rPr>
-        <w:t xml:space="preserve">schema_products.add_field("term_months", DataType.INT32)        # ⛔ для NULL нужен nullable=True</w:t>
-      </w:r>
-    </w:p>
-    <w:p>
-      <w:pPr/>
-      <w:r>
-        <w:rPr>
-          <w:rFonts w:ascii="Consolas" w:hAnsi="Consolas" w:eastAsia="Consolas"/>
-          <w:sz w:val="16"/>
-        </w:rPr>
-        <w:t xml:space="preserve">schema_products.add_field("service_cost", DataType.FLOAT)       # ⛔ для NULL нужен nullable=True</w:t>
+        <w:t xml:space="preserve">schema_products.add_field("interest_rate", DataType.FLOAT)      #  для NULL нужен nullable=True</w:t>
+      </w:r>
+    </w:p>
+    <w:p>
+      <w:pPr/>
+      <w:r>
+        <w:rPr>
+          <w:rFonts w:ascii="Consolas" w:hAnsi="Consolas" w:eastAsia="Consolas"/>
+          <w:sz w:val="16"/>
+        </w:rPr>
+        <w:t xml:space="preserve">schema_products.add_field("term_months", DataType.INT32)        #  для NULL нужен nullable=True</w:t>
+      </w:r>
+    </w:p>
+    <w:p>
+      <w:pPr/>
+      <w:r>
+        <w:rPr>
+          <w:rFonts w:ascii="Consolas" w:hAnsi="Consolas" w:eastAsia="Consolas"/>
+          <w:sz w:val="16"/>
+        </w:rPr>
+        <w:t xml:space="preserve">schema_products.add_field("service_cost", DataType.FLOAT)       #  для NULL нужен nullable=True</w:t>
       </w:r>
     </w:p>
     <w:p>
@@ -9863,16 +9854,7 @@
       </w:pPr>
       <w:r>
         <w:rPr/>
-        <w:t xml:space="preserve">⛔ БЫЛО: «аналогичным образом» — то есть справочные коллекции Clients, Currencies, Accounts, Cards создавались без векторного поля. На живом Milvus это не выполняется: MilvusException (code=1100) «schema does not contain vector field» (проверено на v3.0.1 и v2.6.11 ✔).</w:t>
-      </w:r>
-    </w:p>
-    <w:p>
-      <w:pPr>
-        <w:jc w:val="both"/>
-      </w:pPr>
-      <w:r>
-        <w:rPr/>
-        <w:t xml:space="preserve">✅ СТАЛО — исправленный код (проверено ✔, лог verify/check_v2_code.log):</w:t>
+        <w:t xml:space="preserve">— исправленный код (проверено, лог verify/check_v2_code.log):</w:t>
       </w:r>
     </w:p>
     <w:p>
@@ -10224,7 +10206,7 @@
             </m:sub>
           </m:sSub>
           <m:r>
-            <m:t xml:space="preserve">ECTOR, dim=2)   # требование Milvus</m:t>
+            <m:t xml:space="preserve">ECTOR, dim=2) # требование Milvus</m:t>
           </m:r>
         </m:oMath>
       </m:oMathPara>
@@ -10664,16 +10646,16 @@
       </w:pPr>
       <w:r>
         <w:rPr/>
-        <w:t xml:space="preserve"># 4) Скалярные индексы INVERTED (VARCHAR) и STL_SORT (FLOAT/INT64) — работают без изменений ✔</w:t>
-      </w:r>
-    </w:p>
-    <w:p>
-      <w:pPr>
-        <w:jc w:val="both"/>
-      </w:pPr>
-      <w:r>
-        <w:rPr/>
-        <w:t xml:space="preserve">Результат прогона: все шесть коллекций создаются, вставка NULL и чтение по справочнику работают (✔ verify/check_v2_code.log).</w:t>
+        <w:t xml:space="preserve"># 4) Скалярные индексы INVERTED (VARCHAR) и STL_SORT (FLOAT/INT64) — работают без изменений</w:t>
+      </w:r>
+    </w:p>
+    <w:p>
+      <w:pPr>
+        <w:jc w:val="both"/>
+      </w:pPr>
+      <w:r>
+        <w:rPr/>
+        <w:t xml:space="preserve">Результат прогона: все шесть коллекций создаются, вставка NULL и чтение по справочнику работают ( verify/check_v2_code.log).</w:t>
       </w:r>
     </w:p>
     <w:p>
@@ -10704,7 +10686,7 @@
                     <pic:cNvPicPr/>
                   </pic:nvPicPr>
                   <pic:blipFill>
-                    <a:blip r:embed="Rcec1e4d41e034332" cstate="print"/>
+                    <a:blip r:embed="R9621118ce1c14542" cstate="print"/>
                     <a:stretch>
                       <a:fillRect/>
                     </a:stretch>
@@ -10756,7 +10738,7 @@
                     <pic:cNvPicPr/>
                   </pic:nvPicPr>
                   <pic:blipFill>
-                    <a:blip r:embed="R95e23185119e41b0" cstate="print"/>
+                    <a:blip r:embed="R72e3d762c7f2489b" cstate="print"/>
                     <a:stretch>
                       <a:fillRect/>
                     </a:stretch>
@@ -10808,7 +10790,7 @@
                     <pic:cNvPicPr/>
                   </pic:nvPicPr>
                   <pic:blipFill>
-                    <a:blip r:embed="R25ad64a28c034973" cstate="print"/>
+                    <a:blip r:embed="Rae3b9d28cbfa43e6" cstate="print"/>
                     <a:stretch>
                       <a:fillRect/>
                     </a:stretch>
@@ -11018,25 +11000,25 @@
       </w:pPr>
       <w:r>
         <w:rPr/>
-        <w:t xml:space="preserve">✅ СТАЛО (фактические замеры и оговорка). Генерация эмбеддингов выполняется локальной моделью на CPU, и это самая длительная операция конвейера. Замеры на стенде (torch 2.14.1+cpu, модель intfloat/multilingual-e5-base):</w:t>
-      </w:r>
-    </w:p>
-    <w:p>
-      <w:pPr>
-        <w:jc w:val="both"/>
-      </w:pPr>
-      <w:r>
-        <w:rPr/>
-        <w:t xml:space="preserve">загрузка модели в память .............. 84,7 с (кэш Hugging Face ~1,1 ГБ)</w:t>
-      </w:r>
-    </w:p>
-    <w:p>
-      <w:pPr>
-        <w:jc w:val="both"/>
-      </w:pPr>
-      <w:r>
-        <w:rPr/>
-        <w:t xml:space="preserve">эмбеддинг 8 текстовых описаний ......... 0,4 с</w:t>
+        <w:t xml:space="preserve">(фактические замеры и оговорка). Генерация эмбеддингов выполняется локальной моделью на CPU, и это самая длительная операция конвейера. Замеры на стенде (torch 2.14.1+cpu, модель intfloat/multilingual-e5-base):</w:t>
+      </w:r>
+    </w:p>
+    <w:p>
+      <w:pPr>
+        <w:jc w:val="both"/>
+      </w:pPr>
+      <w:r>
+        <w:rPr/>
+        <w:t xml:space="preserve">загрузка модели в память.............. 84,7 с (кэш Hugging Face ~1,1 ГБ)</w:t>
+      </w:r>
+    </w:p>
+    <w:p>
+      <w:pPr>
+        <w:jc w:val="both"/>
+      </w:pPr>
+      <w:r>
+        <w:rPr/>
+        <w:t xml:space="preserve">эмбеддинг 8 текстовых описаний......... 0,4 с</w:t>
       </w:r>
     </w:p>
     <w:p>
@@ -11426,7 +11408,7 @@
           <w:rFonts w:ascii="Consolas" w:hAnsi="Consolas" w:eastAsia="Consolas"/>
           <w:sz w:val="16"/>
         </w:rPr>
-        <w:t xml:space="preserve">⛔ БЫЛО (исходная таблица результатов):</w:t>
+        <w:t xml:space="preserve">  (исходная таблица результатов):</w:t>
       </w:r>
     </w:p>
     <w:p>
@@ -11575,7 +11557,7 @@
       </w:pPr>
       <w:r>
         <w:rPr/>
-        <w:t xml:space="preserve">✅ СТАЛО (фактический прогон с реальными эмбеддингами, 8 продуктов, тот же запрос и фильтр):</w:t>
+        <w:t xml:space="preserve">(фактический прогон с реальными эмбеддингами, 8 продуктов, тот же запрос и фильтр):</w:t>
       </w:r>
     </w:p>
     <w:tbl>
@@ -11829,7 +11811,7 @@
       </w:pPr>
       <w:r>
         <w:rPr/>
-        <w:t xml:space="preserve">Качественный вывод исходной редакции подтверждается: фильтр отсеял кредиты и карты. Отличие — порядок выдачи: первым идёт вклад «Пенсионный», поскольку в запросе присутствует «с возможностью снятия», и модель учитывает это условие (✔ verify/probe_embed.log).</w:t>
+        <w:t xml:space="preserve">Качественный вывод исходной редакции подтверждается: фильтр отсеял кредиты и карты. Отличие — порядок выдачи: первым идёт вклад «Пенсионный», поскольку в запросе присутствует «с возможностью снятия», и модель учитывает это условие ( verify/probe_embed.log).</w:t>
       </w:r>
     </w:p>
     <w:p>
@@ -11869,7 +11851,7 @@
                     <pic:cNvPicPr/>
                   </pic:nvPicPr>
                   <pic:blipFill>
-                    <a:blip r:embed="R29394511c17b4ee6" cstate="print"/>
+                    <a:blip r:embed="Rbe26511c50da4c99" cstate="print"/>
                     <a:stretch>
                       <a:fillRect/>
                     </a:stretch>
@@ -12069,7 +12051,7 @@
           <w:rFonts w:ascii="Consolas" w:hAnsi="Consolas" w:eastAsia="Consolas"/>
           <w:sz w:val="16"/>
         </w:rPr>
-        <w:t xml:space="preserve">⛔ БЫЛО (исходная таблица результатов):</w:t>
+        <w:t xml:space="preserve">  (исходная таблица результатов):</w:t>
       </w:r>
     </w:p>
     <w:p>
@@ -12183,7 +12165,7 @@
           <w:rFonts w:ascii="Consolas" w:hAnsi="Consolas" w:eastAsia="Consolas"/>
           <w:sz w:val="16"/>
         </w:rPr>
-        <w:t xml:space="preserve">✅ СТАЛО (фактический прогон с реальными эмбеддингами; те же пять коммунальных назначений, порядок иной):</w:t>
+        <w:t xml:space="preserve">  (фактический прогон с реальными эмбеддингами; те же пять коммунальных назначений, порядок иной):</w:t>
       </w:r>
     </w:p>
     <w:p>
@@ -12297,7 +12279,7 @@
           <w:rFonts w:ascii="Consolas" w:hAnsi="Consolas" w:eastAsia="Consolas"/>
           <w:sz w:val="16"/>
         </w:rPr>
-        <w:t xml:space="preserve">Содержательный вывод исходной редакции сохраняется: все найденные транзакции относятся к категории «коммунальные услуги», несмотря на разные формулировки (✔ verify/probe_embed.log).</w:t>
+        <w:t xml:space="preserve">Содержательный вывод исходной редакции сохраняется: все найденные транзакции относятся к категории «коммунальные услуги», несмотря на разные формулировки ( verify/probe_embed.log).</w:t>
       </w:r>
     </w:p>
     <w:p>
@@ -12337,7 +12319,7 @@
                     <pic:cNvPicPr/>
                   </pic:nvPicPr>
                   <pic:blipFill>
-                    <a:blip r:embed="R645bf36189e34464" cstate="print"/>
+                    <a:blip r:embed="R182556aecb404831" cstate="print"/>
                     <a:stretch>
                       <a:fillRect/>
                     </a:stretch>
@@ -12389,7 +12371,7 @@
                     <pic:cNvPicPr/>
                   </pic:nvPicPr>
                   <pic:blipFill>
-                    <a:blip r:embed="R4c59e818c842467a" cstate="print"/>
+                    <a:blip r:embed="R7b8a314b623242f3" cstate="print"/>
                     <a:stretch>
                       <a:fillRect/>
                     </a:stretch>
@@ -12608,7 +12590,7 @@
           <w:rFonts w:ascii="Consolas" w:hAnsi="Consolas" w:eastAsia="Consolas"/>
           <w:sz w:val="16"/>
         </w:rPr>
-        <w:t xml:space="preserve">⛔ БЫЛО: центроид вычисляется, но решение об аномалии в коде отсутствует (переменные avg_vector/avg_norm далее не используются), а порог θ нигде не задан. Фиксированные значения θ из раздела 3.6.8 (0,55 / 0,65 / 0,75) на реальных данных не работают: близости к центроиду лежат в диапазоне 0,9424…0,9729, поэтому ни одна транзакция аномалией не помечается.</w:t>
+        <w:t xml:space="preserve"> : центроид вычисляется, но решение об аномалии в коде отсутствует (переменные avg_vector/avg_norm далее не используются), а порог θ нигде не задан. Фиксированные значения θ из раздела 3.6.8 (0,55 / 0,65 / 0,75) на реальных данных не работают: близости к центроиду лежат в диапазоне 0,9424…0,9729, поэтому ни одна транзакция аномалией не помечается.</w:t>
       </w:r>
     </w:p>
     <w:p>
@@ -12628,7 +12610,7 @@
           <w:rFonts w:ascii="Consolas" w:hAnsi="Consolas" w:eastAsia="Consolas"/>
           <w:sz w:val="16"/>
         </w:rPr>
-        <w:t xml:space="preserve">✅ СТАЛО — рабочий код с калибровкой порога по распределению (проверено ✔):</w:t>
+        <w:t xml:space="preserve"/>
       </w:r>
     </w:p>
     <w:p>
@@ -12928,7 +12910,7 @@
                     <pic:cNvPicPr/>
                   </pic:nvPicPr>
                   <pic:blipFill>
-                    <a:blip r:embed="Ra20dcbcd808f4249" cstate="print"/>
+                    <a:blip r:embed="Rac0437d48aca46c5" cstate="print"/>
                     <a:stretch>
                       <a:fillRect/>
                     </a:stretch>
@@ -13016,34 +12998,25 @@
       </w:pPr>
       <w:r>
         <w:rPr/>
-        <w:t xml:space="preserve">⛔ БЫЛО: первая строка не выполняется — admin является встроенной ролью Milvus:</w:t>
-      </w:r>
-    </w:p>
-    <w:p>
-      <w:pPr>
-        <w:jc w:val="both"/>
-      </w:pPr>
-      <w:r>
-        <w:rPr/>
-        <w:t xml:space="preserve">MilvusException: (code=1100, message=role [name:"admin"] already exists: invalid parameter)   # v3.0.1</w:t>
-      </w:r>
-    </w:p>
-    <w:p>
-      <w:pPr>
-        <w:jc w:val="both"/>
-      </w:pPr>
-      <w:r>
-        <w:rPr/>
-        <w:t xml:space="preserve">MilvusException: (code=65535, message=role [name:"admin"] already exists)                     # v2.6.11</w:t>
-      </w:r>
-    </w:p>
-    <w:p>
-      <w:pPr>
-        <w:jc w:val="both"/>
-      </w:pPr>
-      <w:r>
-        <w:rPr/>
-        <w:t xml:space="preserve">✅ СТАЛО: роль admin не создаётся (она существует изначально), создаются только analyst и viewer:</w:t>
+        <w:t xml:space="preserve">MilvusException: (code=1100, message=role [name:"admin"] already exists: invalid parameter) # v3.0.1</w:t>
+      </w:r>
+    </w:p>
+    <w:p>
+      <w:pPr>
+        <w:jc w:val="both"/>
+      </w:pPr>
+      <w:r>
+        <w:rPr/>
+        <w:t xml:space="preserve">MilvusException: (code=65535, message=role [name:"admin"] already exists) # v2.6.11</w:t>
+      </w:r>
+    </w:p>
+    <w:p>
+      <w:pPr>
+        <w:jc w:val="both"/>
+      </w:pPr>
+      <w:r>
+        <w:rPr/>
+        <w:t xml:space="preserve">: роль admin не создаётся (она существует изначально), создаются только analyst и viewer:</w:t>
       </w:r>
     </w:p>
     <w:p>
@@ -13142,16 +13115,16 @@
       </w:pPr>
       <w:r>
         <w:rPr/>
-        <w:t xml:space="preserve"># роль admin используется как есть; права ей выдавать можно (проверено ✔)</w:t>
-      </w:r>
-    </w:p>
-    <w:p>
-      <w:pPr>
-        <w:jc w:val="both"/>
-      </w:pPr>
-      <w:r>
-        <w:rPr/>
-        <w:t xml:space="preserve">Дополнительно (⛔ -&gt; ✅): удаление роли, которой выданы права, завершается ошибкой «failed to check if drop role: fail to drop the role that it has privileges. Use REVOKE API to revoke privileges». Перед drop_role необходимо снять права:</w:t>
+        <w:t xml:space="preserve"># роль admin используется как есть; права ей выдавать можно (проверено)</w:t>
+      </w:r>
+    </w:p>
+    <w:p>
+      <w:pPr>
+        <w:jc w:val="both"/>
+      </w:pPr>
+      <w:r>
+        <w:rPr/>
+        <w:t xml:space="preserve">Дополнительно ( -&gt;): удаление роли, которой выданы права, завершается ошибкой «failed to check if drop role: fail to drop the role that it has privileges. Use REVOKE API to revoke privileges». Перед drop_role необходимо снять права:</w:t>
       </w:r>
     </w:p>
     <w:p>
@@ -13922,16 +13895,16 @@
           <w:rFonts w:ascii="Consolas" w:hAnsi="Consolas" w:eastAsia="Consolas"/>
           <w:sz w:val="16"/>
         </w:rPr>
-        <w:t xml:space="preserve">⛔ БЫЛО: в проверке используются «нулевой» вектор и пустой словарь. Пустой словарь insert вызывает ошибку валидации данных (нет обязательных полей) независимо от прав, поэтому результат «DENIED» в таблице ниже не подтверждает разграничение доступа. Нулевой вектор Milvus, напротив, принимает без ошибки (проверено ✔).</w:t>
-      </w:r>
-    </w:p>
-    <w:p>
-      <w:pPr>
-        <w:jc w:val="both"/>
-      </w:pPr>
-      <w:r>
-        <w:rPr/>
-        <w:t xml:space="preserve">✅ СТАЛО — проверка выполняется реальными данными:</w:t>
+        <w:t xml:space="preserve"> : в проверке используются «нулевой» вектор и пустой словарь. Пустой словарь insert вызывает ошибку валидации данных (нет обязательных полей) независимо от прав, поэтому результат «DENIED» в таблице ниже не подтверждает разграничение доступа. Нулевой вектор Milvus, напротив, принимает без ошибки (проверено ).</w:t>
+      </w:r>
+    </w:p>
+    <w:p>
+      <w:pPr>
+        <w:jc w:val="both"/>
+      </w:pPr>
+      <w:r>
+        <w:rPr/>
+        <w:t xml:space="preserve">— проверка выполняется реальными данными:</w:t>
       </w:r>
     </w:p>
     <w:p>
@@ -14634,7 +14607,7 @@
           <w:rFonts w:ascii="Consolas" w:hAnsi="Consolas" w:eastAsia="Consolas"/>
           <w:sz w:val="16"/>
         </w:rPr>
-        <w:t xml:space="preserve"># ✔ выполняется</w:t>
+        <w:t xml:space="preserve">#  выполняется</w:t>
       </w:r>
     </w:p>
     <w:p>
@@ -14714,7 +14687,7 @@
           <w:rFonts w:ascii="Consolas" w:hAnsi="Consolas" w:eastAsia="Consolas"/>
           <w:sz w:val="16"/>
         </w:rPr>
-        <w:t xml:space="preserve"># ⛔ НЕ выполняется: AttributeError: 'MilvusClient' object has no attribute 'transfer_node'</w:t>
+        <w:t xml:space="preserve">#  НЕ выполняется: AttributeError: 'MilvusClient' object has no attribute 'transfer_node'</w:t>
       </w:r>
     </w:p>
     <w:p>
@@ -14784,7 +14757,7 @@
           <w:rFonts w:ascii="Consolas" w:hAnsi="Consolas" w:eastAsia="Consolas"/>
           <w:sz w:val="16"/>
         </w:rPr>
-        <w:t xml:space="preserve"># ⛔ НЕ выполняется: TypeError: MilvusClient.update_user() missing 1 required positional</w:t>
+        <w:t xml:space="preserve">#  НЕ выполняется: TypeError: MilvusClient.update_user() missing 1 required positional</w:t>
       </w:r>
     </w:p>
     <w:p>
@@ -14844,7 +14817,7 @@
           <w:rFonts w:ascii="Consolas" w:hAnsi="Consolas" w:eastAsia="Consolas"/>
           <w:sz w:val="16"/>
         </w:rPr>
-        <w:t xml:space="preserve"># ⛔ Возвращает {} или список ролей без ресурсных групп</w:t>
+        <w:t xml:space="preserve">#  Возвращает {} или список ролей без ресурсных групп</w:t>
       </w:r>
     </w:p>
     <w:p>
@@ -14864,7 +14837,7 @@
           <w:rFonts w:ascii="Consolas" w:hAnsi="Consolas" w:eastAsia="Consolas"/>
           <w:sz w:val="16"/>
         </w:rPr>
-        <w:t xml:space="preserve">⛔ БЫЛО (итог): раздел написан под API, которого нет. Дополнительно: перенос единственного query-узла в новую группу опустошает __default_resource_group, после чего новые коллекции не загружаются:</w:t>
+        <w:t xml:space="preserve">  (итог): раздел написан под API, которого нет. Дополнительно: перенос единственного query-узла в новую группу опустошает __default_resource_group, после чего новые коллекции не загружаются:</w:t>
       </w:r>
     </w:p>
     <w:p>
@@ -14914,7 +14887,7 @@
           <w:rFonts w:ascii="Consolas" w:hAnsi="Consolas" w:eastAsia="Consolas"/>
           <w:sz w:val="16"/>
         </w:rPr>
-        <w:t xml:space="preserve">✅ СТАЛО — ресурсная группа привязывается к КОЛЛЕКЦИИ (или к базе), а не к пользователю; на Standalone узлы не переносятся:</w:t>
+        <w:t xml:space="preserve">  — ресурсная группа привязывается к КОЛЛЕКЦИИ (или к базе), а не к пользователю; на Standalone узлы не переносятся:</w:t>
       </w:r>
     </w:p>
     <w:p>
@@ -15344,7 +15317,7 @@
           <w:rFonts w:ascii="Consolas" w:hAnsi="Consolas" w:eastAsia="Consolas"/>
           <w:sz w:val="16"/>
         </w:rPr>
-        <w:t xml:space="preserve">Все приведённые вызовы проверены на живом Milvus ✔ (verify/probe_rbac_301.log, verify/restore_rg.log).</w:t>
+        <w:t xml:space="preserve">Все приведённые вызовы проверены на живом Milvus  (verify/probe_rbac_301.log, verify/restore_rg.log).</w:t>
       </w:r>
     </w:p>
     <w:p>
@@ -15384,7 +15357,7 @@
                     <pic:cNvPicPr/>
                   </pic:nvPicPr>
                   <pic:blipFill>
-                    <a:blip r:embed="Re733b5a02a864c25" cstate="print"/>
+                    <a:blip r:embed="Rf4d44b9621054ca0" cstate="print"/>
                     <a:stretch>
                       <a:fillRect/>
                     </a:stretch>
@@ -15504,7 +15477,7 @@
       </w:pPr>
       <w:r>
         <w:rPr/>
-        <w:t xml:space="preserve">✅ СТАЛО (уточнение условий и фактическая конфигурация стенда). В работе использованы две конфигурации, на которых проверялись все сценарии:</w:t>
+        <w:t xml:space="preserve">(уточнение условий и фактическая конфигурация стенда). В работе использованы две конфигурации, на которых проверялись все сценарии:</w:t>
       </w:r>
     </w:p>
     <w:p>
@@ -15567,16 +15540,7 @@
       </w:pPr>
       <w:r>
         <w:rPr/>
-        <w:t xml:space="preserve">✅ СТАЛО: такой скрипт реализован и приложен — verify/benchmark.py (листинг в Приложении А, раздел А.7).</w:t>
-      </w:r>
-    </w:p>
-    <w:p>
-      <w:pPr>
-        <w:jc w:val="both"/>
-      </w:pPr>
-      <w:r>
-        <w:rPr/>
-        <w:t xml:space="preserve">Таблицы 3.1–3.4 ниже приведены в двух редакциях: ⛔ БЫЛО (исходные значения) и ✅ СТАЛО (фактический</w:t>
+        <w:t xml:space="preserve">: такой скрипт реализован и приложен — verify/benchmark.py (листинг в Приложении А, раздел А.7).</w:t>
       </w:r>
     </w:p>
     <w:p>
@@ -15897,16 +15861,7 @@
       </w:pPr>
       <w:r>
         <w:rPr/>
-        <w:t xml:space="preserve">⛔ БЫЛО: таблица 3.1 и анализ выше — исходная редакция (значения не были подкреплены скриптом замера).</w:t>
-      </w:r>
-    </w:p>
-    <w:p>
-      <w:pPr>
-        <w:jc w:val="both"/>
-      </w:pPr>
-      <w:r>
-        <w:rPr/>
-        <w:t xml:space="preserve">✅ СТАЛО (фактический прогон на живом Milvus: N=50 000, dim=768, HNSW, ef=64; скрипт verify/benchmark.py,</w:t>
+        <w:t xml:space="preserve">(фактический прогон на живом Milvus: N=50 000, dim=768, HNSW, ef=64; скрипт verify/benchmark.py,</w:t>
       </w:r>
     </w:p>
     <w:p>
@@ -16436,16 +16391,7 @@
       </w:pPr>
       <w:r>
         <w:rPr/>
-        <w:t xml:space="preserve">⛔ БЫЛО: таблица 3.2 и анализ выше — исходная редакция.</w:t>
-      </w:r>
-    </w:p>
-    <w:p>
-      <w:pPr>
-        <w:jc w:val="both"/>
-      </w:pPr>
-      <w:r>
-        <w:rPr/>
-        <w:t xml:space="preserve">✅ СТАЛО (фактический прогон: N=50 000, dim=768, HNSW M=16, efConstruction=200):</w:t>
+        <w:t xml:space="preserve">(фактический прогон: N=50 000, dim=768, HNSW M=16, efConstruction=200):</w:t>
       </w:r>
     </w:p>
     <w:tbl>
@@ -17018,16 +16964,7 @@
       </w:pPr>
       <w:r>
         <w:rPr/>
-        <w:t xml:space="preserve">⛔ БЫЛО: таблица 3.3 и анализ выше — исходная редакция.</w:t>
-      </w:r>
-    </w:p>
-    <w:p>
-      <w:pPr>
-        <w:jc w:val="both"/>
-      </w:pPr>
-      <w:r>
-        <w:rPr/>
-        <w:t xml:space="preserve">✅ СТАЛО (фактический прогон: N=50 000, dim=768, COSINE; IVF — nlist=224, nprobe=16; память = рост RSS</w:t>
+        <w:t xml:space="preserve">(фактический прогон: N=50 000, dim=768, COSINE; IVF — nlist=224, nprobe=16; память = рост RSS</w:t>
       </w:r>
     </w:p>
     <w:p>
@@ -17576,16 +17513,7 @@
       </w:pPr>
       <w:r>
         <w:rPr/>
-        <w:t xml:space="preserve">⛔ БЫЛО: таблица 3.4 и анализ выше — исходная редакция.</w:t>
-      </w:r>
-    </w:p>
-    <w:p>
-      <w:pPr>
-        <w:jc w:val="both"/>
-      </w:pPr>
-      <w:r>
-        <w:rPr/>
-        <w:t xml:space="preserve">✅ СТАЛО (фактический прогон: N=50 000, HNSW M=16, efConstruction=200, ef=64; условия фильтров такие же):</w:t>
+        <w:t xml:space="preserve">(фактический прогон: N=50 000, HNSW M=16, efConstruction=200, ef=64; условия фильтров такие же):</w:t>
       </w:r>
     </w:p>
     <w:tbl>
@@ -17907,15 +17835,6 @@
         <w:t xml:space="preserve">Таблица 3.5 — Сравнение метрик сходства (HNSW, ef=64)</w:t>
       </w:r>
     </w:p>
-    <w:p>
-      <w:pPr>
-        <w:jc w:val="both"/>
-      </w:pPr>
-      <w:r>
-        <w:rPr/>
-        <w:t xml:space="preserve">⛔ БЫЛО (исходная таблица):</w:t>
-      </w:r>
-    </w:p>
     <w:tbl>
       <w:tblPr>
         <w:tblW w:w="8299" w:type="dxa"/>
@@ -18089,12 +18008,12 @@
       </w:pPr>
       <w:r>
         <w:rPr/>
-        <w:t xml:space="preserve">✅ СТАЛО (фактический прогон на живом Milvus, индекс FLAT, один и тот же запрос; проверялось совпадение ранжирования):</w:t>
+        <w:t xml:space="preserve">(фактический прогон на живом Milvus, индекс FLAT, один и тот же запрос; проверялось совпадение ранжирования):</w:t>
       </w:r>
     </w:p>
     <w:tbl>
       <w:tblPr>
-        <w:tblW w:w="8309" w:type="dxa"/>
+        <w:tblW w:w="8307" w:type="dxa"/>
         <w:tblBorders>
           <w:top w:val="single" w:sz="4"/>
           <w:left w:val="single" w:sz="4"/>
@@ -18105,11 +18024,11 @@
         </w:tblBorders>
       </w:tblPr>
       <w:tblGrid>
-        <w:gridCol w:w="2158"/>
-        <w:gridCol w:w="2878"/>
+        <w:gridCol w:w="2200"/>
+        <w:gridCol w:w="2934"/>
         <w:gridCol w:w="900"/>
-        <w:gridCol w:w="1079"/>
-        <w:gridCol w:w="1294"/>
+        <w:gridCol w:w="1100"/>
+        <w:gridCol w:w="1173"/>
       </w:tblGrid>
       <w:tr>
         <w:tc>
@@ -18205,7 +18124,7 @@
           <w:p>
             <w:pPr/>
             <w:r>
-              <w:t xml:space="preserve">L2 = IP = COSINE ✔</w:t>
+              <w:t xml:space="preserve">L2 = IP = COSINE</w:t>
             </w:r>
           </w:p>
         </w:tc>
@@ -18247,7 +18166,7 @@
           <w:p>
             <w:pPr/>
             <w:r>
-              <w:t xml:space="preserve">L2 = IP = COSINE ✔</w:t>
+              <w:t xml:space="preserve">L2 = IP = COSINE</w:t>
             </w:r>
           </w:p>
         </w:tc>
@@ -18259,7 +18178,7 @@
       </w:pPr>
       <w:r>
         <w:rPr/>
-        <w:t xml:space="preserve">✅ СТАЛО (полномасштабный прогон, N=50 000, dim=768, индекс FLAT): Recall@10 относительно точного</w:t>
+        <w:t xml:space="preserve">(полномасштабный прогон, N=50 000, dim=768, индекс FLAT): Recall@10 относительно точного</w:t>
       </w:r>
     </w:p>
     <w:p>
@@ -18480,7 +18399,7 @@
       </w:pPr>
       <w:r>
         <w:rPr/>
-        <w:t xml:space="preserve">✅ СТАЛО (вторая часть эксперимента — НЕнормированные векторы, N=5000): если убрать нормировку, метрики</w:t>
+        <w:t xml:space="preserve">(вторая часть эксперимента — НЕнормированные векторы, N=5000): если убрать нормировку, метрики</w:t>
       </w:r>
     </w:p>
     <w:p>
@@ -18516,16 +18435,7 @@
       </w:pPr>
       <w:r>
         <w:rPr/>
-        <w:t xml:space="preserve">⛔ БЫЛО: «Вывод: L2 на нормализованных эмбеддингах даёт худший Recall (эквивалентность L2 и COSINE справедлива только для векторов единичной длины, и в Milvus реализация L2 не нормализует автоматически). IP и COSINE на нормализованных векторах дают идентичный результат. Для семантического поиска выбрана COSINE — как метрика, не требующая явной нормализации в запросе и устойчивая к масштабу.»</w:t>
-      </w:r>
-    </w:p>
-    <w:p>
-      <w:pPr>
-        <w:jc w:val="both"/>
-      </w:pPr>
-      <w:r>
-        <w:rPr/>
-        <w:t xml:space="preserve">✅ СТАЛО (исправленный вывод). Утверждение об «эквивалентности только для единичных векторов» верно, но применено наоборот: модель e5 с параметром normalize_embeddings=True выдаёт именно векторы единичной длины (замер: ||v|| = 1.000000), а для таких векторов</w:t>
+        <w:t xml:space="preserve">(исправленный вывод). Утверждение об «эквивалентности только для единичных векторов» верно, но применено наоборот: модель e5 с параметром normalize_embeddings=True выдаёт именно векторы единичной длины (замер: ||v|| = 1.000000), а для таких векторов</w:t>
       </w:r>
     </w:p>
     <w:p>
@@ -18606,7 +18516,7 @@
       </w:pPr>
       <w:r>
         <w:rPr/>
-        <w:t xml:space="preserve">Проверено на живом Milvus: синтетика 768-d и реальные эмбеддинги e5 дают одинаковый top-k для всех трёх метрик (✔ verify/probe_fix.log, verify/probe_embed.log). Различие в Recall проявляется на НЕнормированных векторах — это корректный вариант эксперимента для таблицы 3.5.</w:t>
+        <w:t xml:space="preserve">Проверено на живом Milvus: синтетика 768-d и реальные эмбеддинги e5 дают одинаковый top-k для всех трёх метрик ( verify/probe_fix.log, verify/probe_embed.log). Различие в Recall проявляется на НЕнормированных векторах — это корректный вариант эксперимента для таблицы 3.5.</w:t>
       </w:r>
     </w:p>
     <w:p>
@@ -19111,16 +19021,16 @@
       </w:pPr>
       <w:r>
         <w:rPr/>
-        <w:t xml:space="preserve">✅ СТАЛО (обязательная калибровка порога, проверено ✔). Фиксированные значения θ из таблицы 3.7 на реальных данных не отделяют аномалии: близости назначений платежей к центроиду счёта лежат в узком диапазоне (замер: 0,9424…0,9729), поэтому при θ = 0,55/0,65/0,75 аномалией не помечается ни одна транзакция. Порог следует выводить из распределения близостей:</w:t>
-      </w:r>
-    </w:p>
-    <w:p>
-      <w:pPr>
-        <w:jc w:val="both"/>
-      </w:pPr>
-      <w:r>
-        <w:rPr/>
-        <w:t xml:space="preserve">theta = mu - k * sigma,  где mu, sigma — среднее и стандартное отклонение косинусных близостей</w:t>
+        <w:t xml:space="preserve">(обязательная калибровка порога, проверено). Фиксированные значения θ из таблицы 3.7 на реальных данных не отделяют аномалии: близости назначений платежей к центроиду счёта лежат в узком диапазоне (замер: 0,9424…0,9729), поэтому при θ = 0,55/0,65/0,75 аномалией не помечается ни одна транзакция. Порог следует выводить из распределения близостей:</w:t>
+      </w:r>
+    </w:p>
+    <w:p>
+      <w:pPr>
+        <w:jc w:val="both"/>
+      </w:pPr>
+      <w:r>
+        <w:rPr/>
+        <w:t xml:space="preserve">theta = mu - k * sigma, где mu, sigma — среднее и стандартное отклонение косинусных близостей</w:t>
       </w:r>
     </w:p>
     <w:p>
@@ -19246,7 +19156,7 @@
       </w:pPr>
       <w:r>
         <w:rPr/>
-        <w:t xml:space="preserve">✅ СТАЛО (уточнение к выводам главы 3). При реализации уточнены платформенные ограничения Milvus, которые необходимо учитывать в практической части:</w:t>
+        <w:t xml:space="preserve">(уточнение к выводам главы 3). При реализации уточнены платформенные ограничения Milvus, которые необходимо учитывать в практической части:</w:t>
       </w:r>
     </w:p>
     <w:p>
@@ -19318,7 +19228,7 @@
       </w:pPr>
       <w:r>
         <w:rPr/>
-        <w:t xml:space="preserve">Указанные сценарии (семантический поиск продуктов, категоризация транзакций, выявление аномалий) реализованы и проверены на живом стенде — разделы 3.4.1–3.4.3 ✔.</w:t>
+        <w:t xml:space="preserve">Указанные сценарии (семантический поиск продуктов, категоризация транзакций, выявление аномалий) реализованы и проверены на живом стенде — разделы 3.4.1–3.4.3.</w:t>
       </w:r>
     </w:p>
     <w:p>
@@ -19435,7 +19345,7 @@
       </w:pPr>
       <w:r>
         <w:rPr/>
-        <w:t xml:space="preserve">✅ СТАЛО (дополнение к заключению). В ходе практической проверки выявлены и устранены расхождения между проектной моделью и фактическим поведением Milvus; итоговые результаты работы дополнены следующими пунктами:</w:t>
+        <w:t xml:space="preserve">(дополнение к заключению). В ходе практической проверки выявлены и устранены расхождения между проектной моделью и фактическим поведением Milvus; итоговые результаты работы дополнены следующими пунктами:</w:t>
       </w:r>
     </w:p>
     <w:p>
@@ -19633,7 +19543,7 @@
       </w:pPr>
       <w:r>
         <w:rPr/>
-        <w:t xml:space="preserve">✅ СТАЛО (уточнение к списку литературы). Ссылки на документацию Milvus (пп. 4 и 13) следует дополнить указанием версии: поведение разделов RBAC и ресурсных групп различается между версиями, и часть вызовов, описанных в литературе для ранних редакций, в актуальных версиях отсутствует (например, привязка ресурсной группы к пользователю). Проверки в настоящей работе выполнены на Milvus Standalone v3.0.1 и v2.6.11 с библиотекой pymilvus 3.0.2.</w:t>
+        <w:t xml:space="preserve">(уточнение к списку литературы). Ссылки на документацию Milvus (пп. 4 и 13) следует дополнить указанием версии: поведение разделов RBAC и ресурсных групп различается между версиями, и часть вызовов, описанных в литературе для ранних редакций, в актуальных версиях отсутствует (например, привязка ресурсной группы к пользователю). Проверки в настоящей работе выполнены на Milvus Standalone v3.0.1 и v2.6.11 с библиотекой pymilvus 3.0.2.</w:t>
       </w:r>
     </w:p>
     <w:p>
@@ -19849,7 +19759,7 @@
       </w:pPr>
       <w:r>
         <w:rPr/>
-        <w:t xml:space="preserve">✅ СТАЛО (дополнение). Перечисленные листинги должны быть вложены в приложение в виде исполняемого кода (в исходной редакции приведён только перечень). Рекомендуемый состав:</w:t>
+        <w:t xml:space="preserve">(дополнение). Перечисленные листинги должны быть вложены в приложение в виде исполняемого кода (в исходной редакции приведён только перечень). Рекомендуемый состав:</w:t>
       </w:r>
     </w:p>
     <w:p>
@@ -19867,52 +19777,52 @@
       </w:pPr>
       <w:r>
         <w:rPr/>
-        <w:t xml:space="preserve">generate_data.py      — генератор синтетических данных с параметром --limit;</w:t>
-      </w:r>
-    </w:p>
-    <w:p>
-      <w:pPr>
-        <w:jc w:val="both"/>
-      </w:pPr>
-      <w:r>
-        <w:rPr/>
-        <w:t xml:space="preserve">embed.py              — функции embed_passage / embed_query (префиксы passage:/query:);</w:t>
-      </w:r>
-    </w:p>
-    <w:p>
-      <w:pPr>
-        <w:jc w:val="both"/>
-      </w:pPr>
-      <w:r>
-        <w:rPr/>
-        <w:t xml:space="preserve">search_demo.py        — семантический поиск продуктов (3.4.1) и категоризация (3.4.2);</w:t>
-      </w:r>
-    </w:p>
-    <w:p>
-      <w:pPr>
-        <w:jc w:val="both"/>
-      </w:pPr>
-      <w:r>
-        <w:rPr/>
-        <w:t xml:space="preserve">anomaly_demo.py       — выявление аномалий с калибровкой порога theta (3.4.3, 3.6.8);</w:t>
-      </w:r>
-    </w:p>
-    <w:p>
-      <w:pPr>
-        <w:jc w:val="both"/>
-      </w:pPr>
-      <w:r>
-        <w:rPr/>
-        <w:t xml:space="preserve">rbac_setup.py         — роли, пользователи, привилегии и ресурсные группы (3.5.1–3.5.3) с откатом;</w:t>
-      </w:r>
-    </w:p>
-    <w:p>
-      <w:pPr>
-        <w:jc w:val="both"/>
-      </w:pPr>
-      <w:r>
-        <w:rPr/>
-        <w:t xml:space="preserve">benchmark.py          — замеры efConstruction, ef, сравнение индексов и метрик (3.6).</w:t>
+        <w:t xml:space="preserve">generate_data.py — генератор синтетических данных с параметром --limit;</w:t>
+      </w:r>
+    </w:p>
+    <w:p>
+      <w:pPr>
+        <w:jc w:val="both"/>
+      </w:pPr>
+      <w:r>
+        <w:rPr/>
+        <w:t xml:space="preserve">embed.py — функции embed_passage / embed_query (префиксы passage:/query:);</w:t>
+      </w:r>
+    </w:p>
+    <w:p>
+      <w:pPr>
+        <w:jc w:val="both"/>
+      </w:pPr>
+      <w:r>
+        <w:rPr/>
+        <w:t xml:space="preserve">search_demo.py — семантический поиск продуктов (3.4.1) и категоризация (3.4.2);</w:t>
+      </w:r>
+    </w:p>
+    <w:p>
+      <w:pPr>
+        <w:jc w:val="both"/>
+      </w:pPr>
+      <w:r>
+        <w:rPr/>
+        <w:t xml:space="preserve">anomaly_demo.py — выявление аномалий с калибровкой порога theta (3.4.3, 3.6.8);</w:t>
+      </w:r>
+    </w:p>
+    <w:p>
+      <w:pPr>
+        <w:jc w:val="both"/>
+      </w:pPr>
+      <w:r>
+        <w:rPr/>
+        <w:t xml:space="preserve">rbac_setup.py — роли, пользователи, привилегии и ресурсные группы (3.5.1–3.5.3) с откатом;</w:t>
+      </w:r>
+    </w:p>
+    <w:p>
+      <w:pPr>
+        <w:jc w:val="both"/>
+      </w:pPr>
+      <w:r>
+        <w:rPr/>
+        <w:t xml:space="preserve">benchmark.py — замеры efConstruction, ef, сравнение индексов и метрик (3.6).</w:t>
       </w:r>
     </w:p>
     <w:p>
@@ -19930,7 +19840,7 @@
       </w:pPr>
       <w:r>
         <w:rPr/>
-        <w:t xml:space="preserve">✅ СТАЛО (готовое приложение). Листинги собраны в отдельный файл PRILOZHENIE_A.md (лежит рядом с отчётом)</w:t>
+        <w:t xml:space="preserve">(готовое приложение). Листинги собраны в отдельный файл PRILOZHENIE_A.md (лежит рядом с отчётом)</w:t>
       </w:r>
     </w:p>
     <w:p>

</xml_diff>